<commit_message>
feat: integrate workload system and unified dashboard layout 50/50
</commit_message>
<xml_diff>
--- a/Doc/ประเภทงาน แบ่งเป็น.docx
+++ b/Doc/ประเภทงาน แบ่งเป็น.docx
@@ -49,13 +49,16 @@
     </w:p>
     <w:p>
       <w:r>
-        <w:t>2.Wefsite/</w:t>
-      </w:r>
-      <w:r>
-        <w:t xml:space="preserve"> </w:t>
-      </w:r>
-      <w:r>
-        <w:t>Infographic</w:t>
+        <w:t>2.We</w:t>
+      </w:r>
+      <w:r>
+        <w:t>b</w:t>
+      </w:r>
+      <w:r>
+        <w:t>site/</w:t>
+      </w:r>
+      <w:r>
+        <w:t xml:space="preserve"> Infographic</w:t>
       </w:r>
     </w:p>
     <w:p>
@@ -102,7 +105,6 @@
     <w:p>
       <w:pPr>
         <w:rPr>
-          <w:rFonts w:hint="cs"/>
           <w:cs/>
         </w:rPr>
       </w:pPr>

</xml_diff>